<commit_message>
I have completed the raedme section
</commit_message>
<xml_diff>
--- a/data/HR Analytics readme.docx
+++ b/data/HR Analytics readme.docx
@@ -66,7 +66,7 @@
     </w:p>
     <w:p>
       <w:pPr>
-        <w:pStyle w:val="6"/>
+        <w:pStyle w:val="7"/>
         <w:keepNext w:val="0"/>
         <w:keepLines w:val="0"/>
         <w:widowControl/>
@@ -91,7 +91,7 @@
     </w:p>
     <w:p>
       <w:pPr>
-        <w:pStyle w:val="6"/>
+        <w:pStyle w:val="7"/>
         <w:keepNext w:val="0"/>
         <w:keepLines w:val="0"/>
         <w:widowControl/>
@@ -141,7 +141,7 @@
     </w:p>
     <w:p>
       <w:pPr>
-        <w:pStyle w:val="6"/>
+        <w:pStyle w:val="7"/>
         <w:keepNext w:val="0"/>
         <w:keepLines w:val="0"/>
         <w:widowControl/>
@@ -166,7 +166,7 @@
     </w:p>
     <w:p>
       <w:pPr>
-        <w:pStyle w:val="6"/>
+        <w:pStyle w:val="7"/>
         <w:keepNext w:val="0"/>
         <w:keepLines w:val="0"/>
         <w:widowControl/>
@@ -361,7 +361,7 @@
     </w:p>
     <w:p>
       <w:pPr>
-        <w:pStyle w:val="6"/>
+        <w:pStyle w:val="7"/>
         <w:keepNext w:val="0"/>
         <w:keepLines w:val="0"/>
         <w:widowControl/>
@@ -383,7 +383,7 @@
       </w:r>
       <w:r>
         <w:rPr>
-          <w:rStyle w:val="7"/>
+          <w:rStyle w:val="8"/>
           <w:rFonts w:hint="default" w:ascii="Times New Roman" w:hAnsi="Times New Roman" w:cs="Times New Roman"/>
           <w:b w:val="0"/>
           <w:bCs w:val="0"/>
@@ -402,7 +402,7 @@
       </w:r>
       <w:r>
         <w:rPr>
-          <w:rStyle w:val="7"/>
+          <w:rStyle w:val="8"/>
           <w:rFonts w:hint="default" w:ascii="Times New Roman" w:hAnsi="Times New Roman" w:cs="Times New Roman"/>
           <w:b w:val="0"/>
           <w:bCs w:val="0"/>
@@ -421,7 +421,7 @@
       </w:r>
       <w:r>
         <w:rPr>
-          <w:rStyle w:val="7"/>
+          <w:rStyle w:val="8"/>
           <w:rFonts w:hint="default" w:ascii="Times New Roman" w:hAnsi="Times New Roman" w:cs="Times New Roman"/>
           <w:b w:val="0"/>
           <w:bCs w:val="0"/>
@@ -441,7 +441,7 @@
     </w:p>
     <w:p>
       <w:pPr>
-        <w:pStyle w:val="6"/>
+        <w:pStyle w:val="7"/>
         <w:keepNext w:val="0"/>
         <w:keepLines w:val="0"/>
         <w:widowControl/>
@@ -463,7 +463,7 @@
       </w:r>
       <w:r>
         <w:rPr>
-          <w:rStyle w:val="7"/>
+          <w:rStyle w:val="8"/>
           <w:rFonts w:hint="default" w:ascii="Times New Roman" w:hAnsi="Times New Roman" w:cs="Times New Roman"/>
           <w:b w:val="0"/>
           <w:bCs w:val="0"/>
@@ -482,7 +482,7 @@
       </w:r>
       <w:r>
         <w:rPr>
-          <w:rStyle w:val="7"/>
+          <w:rStyle w:val="8"/>
           <w:rFonts w:hint="default" w:ascii="Times New Roman" w:hAnsi="Times New Roman" w:cs="Times New Roman"/>
           <w:b w:val="0"/>
           <w:bCs w:val="0"/>
@@ -501,7 +501,7 @@
       </w:r>
       <w:r>
         <w:rPr>
-          <w:rStyle w:val="7"/>
+          <w:rStyle w:val="8"/>
           <w:rFonts w:hint="default" w:ascii="Times New Roman" w:hAnsi="Times New Roman" w:cs="Times New Roman"/>
           <w:b w:val="0"/>
           <w:bCs w:val="0"/>
@@ -520,7 +520,7 @@
       </w:r>
       <w:r>
         <w:rPr>
-          <w:rStyle w:val="7"/>
+          <w:rStyle w:val="8"/>
           <w:rFonts w:hint="default" w:ascii="Times New Roman" w:hAnsi="Times New Roman" w:cs="Times New Roman"/>
           <w:b w:val="0"/>
           <w:bCs w:val="0"/>
@@ -539,7 +539,7 @@
       </w:r>
       <w:r>
         <w:rPr>
-          <w:rStyle w:val="7"/>
+          <w:rStyle w:val="8"/>
           <w:rFonts w:hint="default" w:ascii="Times New Roman" w:hAnsi="Times New Roman" w:cs="Times New Roman"/>
           <w:b w:val="0"/>
           <w:bCs w:val="0"/>
@@ -558,7 +558,7 @@
       </w:r>
       <w:r>
         <w:rPr>
-          <w:rStyle w:val="7"/>
+          <w:rStyle w:val="8"/>
           <w:rFonts w:hint="default" w:ascii="Times New Roman" w:hAnsi="Times New Roman" w:cs="Times New Roman"/>
           <w:b w:val="0"/>
           <w:bCs w:val="0"/>
@@ -587,7 +587,7 @@
       </w:r>
       <w:r>
         <w:rPr>
-          <w:rStyle w:val="7"/>
+          <w:rStyle w:val="8"/>
           <w:rFonts w:hint="default" w:ascii="Times New Roman" w:hAnsi="Times New Roman" w:cs="Times New Roman"/>
           <w:b w:val="0"/>
           <w:bCs w:val="0"/>
@@ -607,7 +607,7 @@
     </w:p>
     <w:p>
       <w:pPr>
-        <w:pStyle w:val="6"/>
+        <w:pStyle w:val="7"/>
         <w:keepNext w:val="0"/>
         <w:keepLines w:val="0"/>
         <w:widowControl/>
@@ -629,7 +629,7 @@
       </w:r>
       <w:r>
         <w:rPr>
-          <w:rStyle w:val="7"/>
+          <w:rStyle w:val="8"/>
           <w:rFonts w:hint="default" w:ascii="Times New Roman" w:hAnsi="Times New Roman" w:cs="Times New Roman"/>
           <w:b w:val="0"/>
           <w:bCs w:val="0"/>
@@ -648,7 +648,7 @@
       </w:r>
       <w:r>
         <w:rPr>
-          <w:rStyle w:val="7"/>
+          <w:rStyle w:val="8"/>
           <w:rFonts w:hint="default" w:ascii="Times New Roman" w:hAnsi="Times New Roman" w:cs="Times New Roman"/>
           <w:b w:val="0"/>
           <w:bCs w:val="0"/>
@@ -678,7 +678,7 @@
     </w:p>
     <w:p>
       <w:pPr>
-        <w:pStyle w:val="6"/>
+        <w:pStyle w:val="7"/>
         <w:keepNext w:val="0"/>
         <w:keepLines w:val="0"/>
         <w:widowControl/>
@@ -710,7 +710,7 @@
       </w:r>
       <w:r>
         <w:rPr>
-          <w:rStyle w:val="7"/>
+          <w:rStyle w:val="8"/>
           <w:rFonts w:hint="default" w:ascii="Times New Roman" w:hAnsi="Times New Roman" w:cs="Times New Roman"/>
           <w:b w:val="0"/>
           <w:bCs w:val="0"/>
@@ -740,7 +740,7 @@
     </w:p>
     <w:p>
       <w:pPr>
-        <w:pStyle w:val="6"/>
+        <w:pStyle w:val="7"/>
         <w:keepNext w:val="0"/>
         <w:keepLines w:val="0"/>
         <w:widowControl/>
@@ -780,7 +780,7 @@
     </w:p>
     <w:p>
       <w:pPr>
-        <w:pStyle w:val="6"/>
+        <w:pStyle w:val="7"/>
         <w:keepNext w:val="0"/>
         <w:keepLines w:val="0"/>
         <w:widowControl/>
@@ -830,7 +830,7 @@
       </w:r>
       <w:r>
         <w:rPr>
-          <w:rStyle w:val="7"/>
+          <w:rStyle w:val="8"/>
           <w:rFonts w:hint="default" w:ascii="Times New Roman" w:hAnsi="Times New Roman" w:cs="Times New Roman"/>
           <w:b w:val="0"/>
           <w:bCs w:val="0"/>
@@ -849,7 +849,7 @@
       </w:r>
       <w:r>
         <w:rPr>
-          <w:rStyle w:val="7"/>
+          <w:rStyle w:val="8"/>
           <w:rFonts w:hint="default" w:ascii="Times New Roman" w:hAnsi="Times New Roman" w:cs="Times New Roman"/>
           <w:b w:val="0"/>
           <w:bCs w:val="0"/>
@@ -894,7 +894,7 @@
       </w:r>
       <w:r>
         <w:rPr>
-          <w:rStyle w:val="7"/>
+          <w:rStyle w:val="8"/>
           <w:rFonts w:hint="default" w:ascii="Times New Roman" w:hAnsi="Times New Roman" w:cs="Times New Roman"/>
           <w:b w:val="0"/>
           <w:bCs w:val="0"/>
@@ -939,7 +939,7 @@
       </w:r>
       <w:r>
         <w:rPr>
-          <w:rStyle w:val="7"/>
+          <w:rStyle w:val="8"/>
           <w:rFonts w:hint="default" w:ascii="Times New Roman" w:hAnsi="Times New Roman" w:cs="Times New Roman"/>
           <w:b w:val="0"/>
           <w:bCs w:val="0"/>
@@ -958,7 +958,7 @@
       </w:r>
       <w:r>
         <w:rPr>
-          <w:rStyle w:val="7"/>
+          <w:rStyle w:val="8"/>
           <w:rFonts w:hint="default" w:ascii="Times New Roman" w:hAnsi="Times New Roman" w:cs="Times New Roman"/>
           <w:b w:val="0"/>
           <w:bCs w:val="0"/>
@@ -977,7 +977,7 @@
       </w:r>
       <w:r>
         <w:rPr>
-          <w:rStyle w:val="7"/>
+          <w:rStyle w:val="8"/>
           <w:rFonts w:hint="default" w:ascii="Times New Roman" w:hAnsi="Times New Roman" w:cs="Times New Roman"/>
           <w:b w:val="0"/>
           <w:bCs w:val="0"/>
@@ -996,7 +996,7 @@
       </w:r>
       <w:r>
         <w:rPr>
-          <w:rStyle w:val="7"/>
+          <w:rStyle w:val="8"/>
           <w:rFonts w:hint="default" w:ascii="Times New Roman" w:hAnsi="Times New Roman" w:cs="Times New Roman"/>
           <w:b w:val="0"/>
           <w:bCs w:val="0"/>
@@ -1043,7 +1043,7 @@
       </w:pPr>
       <w:r>
         <w:rPr>
-          <w:rStyle w:val="7"/>
+          <w:rStyle w:val="8"/>
           <w:rFonts w:hint="default" w:ascii="Times New Roman" w:hAnsi="Times New Roman" w:cs="Times New Roman"/>
           <w:b w:val="0"/>
           <w:bCs w:val="0"/>
@@ -1062,7 +1062,7 @@
       </w:r>
       <w:r>
         <w:rPr>
-          <w:rStyle w:val="7"/>
+          <w:rStyle w:val="8"/>
           <w:rFonts w:hint="default" w:ascii="Times New Roman" w:hAnsi="Times New Roman" w:cs="Times New Roman"/>
           <w:b w:val="0"/>
           <w:bCs w:val="0"/>
@@ -1107,7 +1107,7 @@
       </w:r>
       <w:r>
         <w:rPr>
-          <w:rStyle w:val="7"/>
+          <w:rStyle w:val="8"/>
           <w:rFonts w:hint="default" w:ascii="Times New Roman" w:hAnsi="Times New Roman" w:cs="Times New Roman"/>
           <w:b w:val="0"/>
           <w:bCs w:val="0"/>
@@ -1152,7 +1152,7 @@
       </w:r>
       <w:r>
         <w:rPr>
-          <w:rStyle w:val="7"/>
+          <w:rStyle w:val="8"/>
           <w:rFonts w:hint="default" w:ascii="Times New Roman" w:hAnsi="Times New Roman" w:cs="Times New Roman"/>
           <w:b w:val="0"/>
           <w:bCs w:val="0"/>
@@ -1197,7 +1197,7 @@
       </w:r>
       <w:r>
         <w:rPr>
-          <w:rStyle w:val="7"/>
+          <w:rStyle w:val="8"/>
           <w:rFonts w:hint="default" w:ascii="Times New Roman" w:hAnsi="Times New Roman" w:cs="Times New Roman"/>
           <w:b w:val="0"/>
           <w:bCs w:val="0"/>
@@ -1213,201 +1213,738 @@
           <w:szCs w:val="24"/>
         </w:rPr>
         <w:t>, reflecting a workforce with moderate organizational experience and valuable institutional knowledge.</w:t>
+      </w:r>
+    </w:p>
+    <w:p>
+      <w:pPr>
+        <w:pStyle w:val="2"/>
+        <w:keepNext w:val="0"/>
+        <w:keepLines w:val="0"/>
+        <w:widowControl/>
+        <w:suppressLineNumbers w:val="0"/>
+        <w:jc w:val="both"/>
+        <w:rPr>
+          <w:rFonts w:hint="default" w:ascii="Times New Roman" w:hAnsi="Times New Roman" w:cs="Times New Roman"/>
+          <w:b w:val="0"/>
+          <w:bCs w:val="0"/>
+          <w:sz w:val="24"/>
+          <w:szCs w:val="24"/>
+        </w:rPr>
+      </w:pPr>
+      <w:r>
+        <w:rPr>
+          <w:rFonts w:hint="default" w:ascii="Times New Roman" w:hAnsi="Times New Roman" w:cs="Times New Roman"/>
+          <w:b w:val="0"/>
+          <w:bCs w:val="0"/>
+          <w:sz w:val="24"/>
+          <w:szCs w:val="24"/>
+        </w:rPr>
+        <w:t>Business Recommendations</w:t>
+      </w:r>
+    </w:p>
+    <w:p>
+      <w:pPr>
+        <w:pStyle w:val="7"/>
+        <w:keepNext w:val="0"/>
+        <w:keepLines w:val="0"/>
+        <w:widowControl/>
+        <w:suppressLineNumbers w:val="0"/>
+        <w:spacing w:before="0" w:beforeAutospacing="1" w:after="0" w:afterAutospacing="1"/>
+        <w:ind w:left="0" w:right="0"/>
+        <w:jc w:val="both"/>
+        <w:rPr>
+          <w:rFonts w:hint="default" w:ascii="Times New Roman" w:hAnsi="Times New Roman" w:cs="Times New Roman"/>
+          <w:sz w:val="24"/>
+          <w:szCs w:val="24"/>
+        </w:rPr>
+      </w:pPr>
+      <w:r>
+        <w:rPr>
+          <w:rFonts w:hint="default" w:ascii="Times New Roman" w:hAnsi="Times New Roman" w:cs="Times New Roman"/>
+          <w:sz w:val="24"/>
+          <w:szCs w:val="24"/>
+        </w:rPr>
+        <w:t>Based on the findings, several recommendations can enhance workforce management and organizational performance.</w:t>
+      </w:r>
+    </w:p>
+    <w:p>
+      <w:pPr>
+        <w:keepNext w:val="0"/>
+        <w:keepLines w:val="0"/>
+        <w:widowControl/>
+        <w:numPr>
+          <w:numId w:val="0"/>
+        </w:numPr>
+        <w:suppressLineNumbers w:val="0"/>
+        <w:spacing w:before="0" w:beforeAutospacing="1" w:after="0" w:afterAutospacing="1"/>
+        <w:jc w:val="both"/>
+        <w:rPr>
+          <w:rFonts w:hint="default" w:ascii="Times New Roman" w:hAnsi="Times New Roman" w:cs="Times New Roman"/>
+          <w:sz w:val="24"/>
+          <w:szCs w:val="24"/>
+        </w:rPr>
+      </w:pPr>
+      <w:r>
+        <w:rPr>
+          <w:rFonts w:hint="default" w:ascii="Times New Roman" w:hAnsi="Times New Roman" w:cs="Times New Roman"/>
+          <w:sz w:val="24"/>
+          <w:szCs w:val="24"/>
+        </w:rPr>
+        <w:t>Strengthen employee retention initiatives by identifying and addressing factors contributing to employee turnover.</w:t>
+      </w:r>
+    </w:p>
+    <w:p>
+      <w:pPr>
+        <w:keepNext w:val="0"/>
+        <w:keepLines w:val="0"/>
+        <w:widowControl/>
+        <w:numPr>
+          <w:numId w:val="0"/>
+        </w:numPr>
+        <w:suppressLineNumbers w:val="0"/>
+        <w:spacing w:before="0" w:beforeAutospacing="1" w:after="0" w:afterAutospacing="1"/>
+        <w:jc w:val="both"/>
+        <w:rPr>
+          <w:rFonts w:hint="default" w:ascii="Times New Roman" w:hAnsi="Times New Roman" w:cs="Times New Roman"/>
+          <w:sz w:val="24"/>
+          <w:szCs w:val="24"/>
+        </w:rPr>
+      </w:pPr>
+      <w:r>
+        <w:rPr>
+          <w:rFonts w:hint="default" w:ascii="Times New Roman" w:hAnsi="Times New Roman" w:cs="Times New Roman"/>
+          <w:sz w:val="24"/>
+          <w:szCs w:val="24"/>
+        </w:rPr>
+        <w:t>Conduct targeted exit interviews and engagement surveys to better understand why high-performing employees leave the organization.</w:t>
+      </w:r>
+    </w:p>
+    <w:p>
+      <w:pPr>
+        <w:keepNext w:val="0"/>
+        <w:keepLines w:val="0"/>
+        <w:widowControl/>
+        <w:numPr>
+          <w:numId w:val="0"/>
+        </w:numPr>
+        <w:suppressLineNumbers w:val="0"/>
+        <w:spacing w:before="0" w:beforeAutospacing="1" w:after="0" w:afterAutospacing="1"/>
+        <w:jc w:val="both"/>
+        <w:rPr>
+          <w:rFonts w:hint="default" w:ascii="Times New Roman" w:hAnsi="Times New Roman" w:cs="Times New Roman"/>
+          <w:sz w:val="24"/>
+          <w:szCs w:val="24"/>
+        </w:rPr>
+      </w:pPr>
+      <w:r>
+        <w:rPr>
+          <w:rFonts w:hint="default" w:ascii="Times New Roman" w:hAnsi="Times New Roman" w:cs="Times New Roman"/>
+          <w:sz w:val="24"/>
+          <w:szCs w:val="24"/>
+        </w:rPr>
+        <w:t>Review departmental compensation structures periodically to ensure fairness, competitiveness, and alignment with organizational objectives.</w:t>
+      </w:r>
+    </w:p>
+    <w:p>
+      <w:pPr>
+        <w:keepNext w:val="0"/>
+        <w:keepLines w:val="0"/>
+        <w:widowControl/>
+        <w:numPr>
+          <w:numId w:val="0"/>
+        </w:numPr>
+        <w:suppressLineNumbers w:val="0"/>
+        <w:spacing w:before="0" w:beforeAutospacing="1" w:after="0" w:afterAutospacing="1"/>
+        <w:jc w:val="both"/>
+        <w:rPr>
+          <w:rFonts w:hint="default" w:ascii="Times New Roman" w:hAnsi="Times New Roman" w:cs="Times New Roman"/>
+          <w:sz w:val="24"/>
+          <w:szCs w:val="24"/>
+        </w:rPr>
+      </w:pPr>
+      <w:r>
+        <w:rPr>
+          <w:rFonts w:hint="default" w:ascii="Times New Roman" w:hAnsi="Times New Roman" w:cs="Times New Roman"/>
+          <w:sz w:val="24"/>
+          <w:szCs w:val="24"/>
+        </w:rPr>
+        <w:t>Continue leveraging performance-based reward systems while regularly evaluating their effectiveness in motivating employees and retaining top talent.</w:t>
+      </w:r>
+    </w:p>
+    <w:p>
+      <w:pPr>
+        <w:keepNext w:val="0"/>
+        <w:keepLines w:val="0"/>
+        <w:widowControl/>
+        <w:numPr>
+          <w:numId w:val="0"/>
+        </w:numPr>
+        <w:suppressLineNumbers w:val="0"/>
+        <w:spacing w:before="0" w:beforeAutospacing="1" w:after="0" w:afterAutospacing="1"/>
+        <w:jc w:val="both"/>
+        <w:rPr>
+          <w:rFonts w:hint="default" w:ascii="Times New Roman" w:hAnsi="Times New Roman" w:cs="Times New Roman"/>
+          <w:sz w:val="24"/>
+          <w:szCs w:val="24"/>
+        </w:rPr>
+      </w:pPr>
+      <w:r>
+        <w:rPr>
+          <w:rFonts w:hint="default" w:ascii="Times New Roman" w:hAnsi="Times New Roman" w:cs="Times New Roman"/>
+          <w:sz w:val="24"/>
+          <w:szCs w:val="24"/>
+        </w:rPr>
+        <w:t>Integrate the dashboard into routine HR reporting to support ongoing workforce monitoring, strategic planning, and evidence-based decision-making.</w:t>
+      </w:r>
+    </w:p>
+    <w:p>
+      <w:pPr>
+        <w:pStyle w:val="2"/>
+        <w:keepNext w:val="0"/>
+        <w:keepLines w:val="0"/>
+        <w:widowControl/>
+        <w:suppressLineNumbers w:val="0"/>
+        <w:rPr>
+          <w:rFonts w:hint="default" w:ascii="Times New Roman" w:hAnsi="Times New Roman" w:cs="Times New Roman"/>
+          <w:b w:val="0"/>
+          <w:bCs w:val="0"/>
+          <w:sz w:val="24"/>
+          <w:szCs w:val="24"/>
+        </w:rPr>
+      </w:pPr>
+      <w:r>
+        <w:rPr>
+          <w:rFonts w:hint="default" w:ascii="Times New Roman" w:hAnsi="Times New Roman" w:cs="Times New Roman"/>
+          <w:b w:val="0"/>
+          <w:bCs w:val="0"/>
+          <w:sz w:val="24"/>
+          <w:szCs w:val="24"/>
+        </w:rPr>
+        <w:t>Tools and Technologies</w:t>
+      </w:r>
+    </w:p>
+    <w:p>
+      <w:pPr>
+        <w:pStyle w:val="4"/>
+        <w:keepNext w:val="0"/>
+        <w:keepLines w:val="0"/>
+        <w:widowControl/>
+        <w:suppressLineNumbers w:val="0"/>
+        <w:rPr>
+          <w:rFonts w:hint="default" w:ascii="Times New Roman" w:hAnsi="Times New Roman" w:cs="Times New Roman"/>
+          <w:sz w:val="24"/>
+          <w:szCs w:val="24"/>
+        </w:rPr>
+      </w:pPr>
+      <w:r>
+        <w:rPr>
+          <w:rFonts w:hint="default" w:ascii="Times New Roman" w:hAnsi="Times New Roman" w:cs="Times New Roman"/>
+          <w:b w:val="0"/>
+          <w:bCs w:val="0"/>
+          <w:sz w:val="24"/>
+          <w:szCs w:val="24"/>
+        </w:rPr>
+        <w:t>Software</w:t>
+      </w:r>
+    </w:p>
+    <w:p>
+      <w:pPr>
+        <w:keepNext w:val="0"/>
+        <w:keepLines w:val="0"/>
+        <w:widowControl/>
+        <w:numPr>
+          <w:numId w:val="0"/>
+        </w:numPr>
+        <w:suppressLineNumbers w:val="0"/>
+        <w:spacing w:before="0" w:beforeAutospacing="1" w:after="0" w:afterAutospacing="1"/>
+        <w:rPr>
+          <w:rFonts w:hint="default" w:ascii="Times New Roman" w:hAnsi="Times New Roman" w:cs="Times New Roman"/>
+          <w:sz w:val="24"/>
+          <w:szCs w:val="24"/>
+        </w:rPr>
+      </w:pPr>
+      <w:r>
+        <w:rPr>
+          <w:rFonts w:hint="default" w:ascii="Times New Roman" w:hAnsi="Times New Roman" w:cs="Times New Roman"/>
+          <w:sz w:val="24"/>
+          <w:szCs w:val="24"/>
+        </w:rPr>
+        <w:t>Microsoft Excel</w:t>
+      </w:r>
+    </w:p>
+    <w:p>
+      <w:pPr>
+        <w:pStyle w:val="4"/>
+        <w:keepNext w:val="0"/>
+        <w:keepLines w:val="0"/>
+        <w:widowControl/>
+        <w:suppressLineNumbers w:val="0"/>
+        <w:rPr>
+          <w:rFonts w:hint="default" w:ascii="Times New Roman" w:hAnsi="Times New Roman" w:cs="Times New Roman"/>
+          <w:sz w:val="24"/>
+          <w:szCs w:val="24"/>
+        </w:rPr>
+      </w:pPr>
+      <w:r>
+        <w:rPr>
+          <w:rFonts w:hint="default" w:ascii="Times New Roman" w:hAnsi="Times New Roman" w:cs="Times New Roman"/>
+          <w:b w:val="0"/>
+          <w:bCs w:val="0"/>
+          <w:sz w:val="24"/>
+          <w:szCs w:val="24"/>
+        </w:rPr>
+        <w:t>Excel Features</w:t>
+      </w:r>
+    </w:p>
+    <w:p>
+      <w:pPr>
+        <w:keepNext w:val="0"/>
+        <w:keepLines w:val="0"/>
+        <w:widowControl/>
+        <w:numPr>
+          <w:numId w:val="0"/>
+        </w:numPr>
+        <w:suppressLineNumbers w:val="0"/>
+        <w:spacing w:before="0" w:beforeAutospacing="1" w:after="0" w:afterAutospacing="1"/>
+        <w:rPr>
+          <w:rFonts w:hint="default" w:ascii="Times New Roman" w:hAnsi="Times New Roman" w:cs="Times New Roman"/>
+          <w:sz w:val="24"/>
+          <w:szCs w:val="24"/>
+        </w:rPr>
+      </w:pPr>
+      <w:r>
+        <w:rPr>
+          <w:rFonts w:hint="default" w:ascii="Times New Roman" w:hAnsi="Times New Roman" w:cs="Times New Roman"/>
+          <w:sz w:val="24"/>
+          <w:szCs w:val="24"/>
+        </w:rPr>
+        <w:t>Advanced Formulas</w:t>
+      </w:r>
+    </w:p>
+    <w:p>
+      <w:pPr>
+        <w:keepNext w:val="0"/>
+        <w:keepLines w:val="0"/>
+        <w:widowControl/>
+        <w:numPr>
+          <w:numId w:val="0"/>
+        </w:numPr>
+        <w:suppressLineNumbers w:val="0"/>
+        <w:spacing w:before="0" w:beforeAutospacing="1" w:after="0" w:afterAutospacing="1"/>
+        <w:rPr>
+          <w:rFonts w:hint="default" w:ascii="Times New Roman" w:hAnsi="Times New Roman" w:cs="Times New Roman"/>
+          <w:sz w:val="24"/>
+          <w:szCs w:val="24"/>
+        </w:rPr>
+      </w:pPr>
+      <w:r>
+        <w:rPr>
+          <w:rFonts w:hint="default" w:ascii="Times New Roman" w:hAnsi="Times New Roman" w:cs="Times New Roman"/>
+          <w:sz w:val="24"/>
+          <w:szCs w:val="24"/>
+        </w:rPr>
+        <w:t>XLOOKUP</w:t>
+      </w:r>
+    </w:p>
+    <w:p>
+      <w:pPr>
+        <w:keepNext w:val="0"/>
+        <w:keepLines w:val="0"/>
+        <w:widowControl/>
+        <w:numPr>
+          <w:numId w:val="0"/>
+        </w:numPr>
+        <w:suppressLineNumbers w:val="0"/>
+        <w:spacing w:before="0" w:beforeAutospacing="1" w:after="0" w:afterAutospacing="1"/>
+        <w:rPr>
+          <w:rFonts w:hint="default" w:ascii="Times New Roman" w:hAnsi="Times New Roman" w:cs="Times New Roman"/>
+          <w:sz w:val="24"/>
+          <w:szCs w:val="24"/>
+        </w:rPr>
+      </w:pPr>
+      <w:r>
+        <w:rPr>
+          <w:rFonts w:hint="default" w:ascii="Times New Roman" w:hAnsi="Times New Roman" w:cs="Times New Roman"/>
+          <w:sz w:val="24"/>
+          <w:szCs w:val="24"/>
+        </w:rPr>
+        <w:t>Pivot Tables</w:t>
+      </w:r>
+    </w:p>
+    <w:p>
+      <w:pPr>
+        <w:keepNext w:val="0"/>
+        <w:keepLines w:val="0"/>
+        <w:widowControl/>
+        <w:numPr>
+          <w:numId w:val="0"/>
+        </w:numPr>
+        <w:suppressLineNumbers w:val="0"/>
+        <w:spacing w:before="0" w:beforeAutospacing="1" w:after="0" w:afterAutospacing="1"/>
+        <w:rPr>
+          <w:rFonts w:hint="default" w:ascii="Times New Roman" w:hAnsi="Times New Roman" w:cs="Times New Roman"/>
+          <w:sz w:val="24"/>
+          <w:szCs w:val="24"/>
+        </w:rPr>
+      </w:pPr>
+      <w:r>
+        <w:rPr>
+          <w:rFonts w:hint="default" w:ascii="Times New Roman" w:hAnsi="Times New Roman" w:cs="Times New Roman"/>
+          <w:sz w:val="24"/>
+          <w:szCs w:val="24"/>
+        </w:rPr>
+        <w:t>Pivot Charts</w:t>
+      </w:r>
+    </w:p>
+    <w:p>
+      <w:pPr>
+        <w:keepNext w:val="0"/>
+        <w:keepLines w:val="0"/>
+        <w:widowControl/>
+        <w:numPr>
+          <w:numId w:val="0"/>
+        </w:numPr>
+        <w:suppressLineNumbers w:val="0"/>
+        <w:spacing w:before="0" w:beforeAutospacing="1" w:after="0" w:afterAutospacing="1"/>
+        <w:rPr>
+          <w:rFonts w:hint="default" w:ascii="Times New Roman" w:hAnsi="Times New Roman" w:cs="Times New Roman"/>
+          <w:sz w:val="24"/>
+          <w:szCs w:val="24"/>
+        </w:rPr>
+      </w:pPr>
+      <w:r>
+        <w:rPr>
+          <w:rFonts w:hint="default" w:ascii="Times New Roman" w:hAnsi="Times New Roman" w:cs="Times New Roman"/>
+          <w:sz w:val="24"/>
+          <w:szCs w:val="24"/>
+        </w:rPr>
+        <w:t>Slicers</w:t>
+      </w:r>
+    </w:p>
+    <w:p>
+      <w:pPr>
+        <w:pStyle w:val="4"/>
+        <w:keepNext w:val="0"/>
+        <w:keepLines w:val="0"/>
+        <w:widowControl/>
+        <w:suppressLineNumbers w:val="0"/>
+        <w:rPr>
+          <w:rFonts w:hint="default" w:ascii="Times New Roman" w:hAnsi="Times New Roman" w:cs="Times New Roman"/>
+          <w:sz w:val="24"/>
+          <w:szCs w:val="24"/>
+        </w:rPr>
+      </w:pPr>
+      <w:r>
+        <w:rPr>
+          <w:rFonts w:hint="default" w:ascii="Times New Roman" w:hAnsi="Times New Roman" w:cs="Times New Roman"/>
+          <w:b w:val="0"/>
+          <w:bCs w:val="0"/>
+          <w:sz w:val="24"/>
+          <w:szCs w:val="24"/>
+        </w:rPr>
+        <w:t>Skills Demonstrated</w:t>
+      </w:r>
+    </w:p>
+    <w:p>
+      <w:pPr>
+        <w:keepNext w:val="0"/>
+        <w:keepLines w:val="0"/>
+        <w:widowControl/>
+        <w:numPr>
+          <w:numId w:val="0"/>
+        </w:numPr>
+        <w:suppressLineNumbers w:val="0"/>
+        <w:spacing w:before="0" w:beforeAutospacing="1" w:after="0" w:afterAutospacing="1"/>
+        <w:rPr>
+          <w:rFonts w:hint="default" w:ascii="Times New Roman" w:hAnsi="Times New Roman" w:cs="Times New Roman"/>
+          <w:sz w:val="24"/>
+          <w:szCs w:val="24"/>
+        </w:rPr>
+      </w:pPr>
+      <w:r>
+        <w:rPr>
+          <w:rFonts w:hint="default" w:ascii="Times New Roman" w:hAnsi="Times New Roman" w:cs="Times New Roman"/>
+          <w:sz w:val="24"/>
+          <w:szCs w:val="24"/>
+        </w:rPr>
+        <w:t>Data Cleaning</w:t>
+      </w:r>
+    </w:p>
+    <w:p>
+      <w:pPr>
+        <w:keepNext w:val="0"/>
+        <w:keepLines w:val="0"/>
+        <w:widowControl/>
+        <w:numPr>
+          <w:numId w:val="0"/>
+        </w:numPr>
+        <w:suppressLineNumbers w:val="0"/>
+        <w:spacing w:before="0" w:beforeAutospacing="1" w:after="0" w:afterAutospacing="1"/>
+        <w:rPr>
+          <w:rFonts w:hint="default" w:ascii="Times New Roman" w:hAnsi="Times New Roman" w:cs="Times New Roman"/>
+          <w:sz w:val="24"/>
+          <w:szCs w:val="24"/>
+        </w:rPr>
+      </w:pPr>
+      <w:r>
+        <w:rPr>
+          <w:rFonts w:hint="default" w:ascii="Times New Roman" w:hAnsi="Times New Roman" w:cs="Times New Roman"/>
+          <w:sz w:val="24"/>
+          <w:szCs w:val="24"/>
+        </w:rPr>
+        <w:t>Data Transformation</w:t>
+      </w:r>
+    </w:p>
+    <w:p>
+      <w:pPr>
+        <w:keepNext w:val="0"/>
+        <w:keepLines w:val="0"/>
+        <w:widowControl/>
+        <w:numPr>
+          <w:numId w:val="0"/>
+        </w:numPr>
+        <w:suppressLineNumbers w:val="0"/>
+        <w:spacing w:before="0" w:beforeAutospacing="1" w:after="0" w:afterAutospacing="1"/>
+        <w:rPr>
+          <w:rFonts w:hint="default" w:ascii="Times New Roman" w:hAnsi="Times New Roman" w:cs="Times New Roman"/>
+          <w:sz w:val="24"/>
+          <w:szCs w:val="24"/>
+        </w:rPr>
+      </w:pPr>
+      <w:r>
+        <w:rPr>
+          <w:rFonts w:hint="default" w:ascii="Times New Roman" w:hAnsi="Times New Roman" w:cs="Times New Roman"/>
+          <w:sz w:val="24"/>
+          <w:szCs w:val="24"/>
+        </w:rPr>
+        <w:t>Exploratory Data Analysis (EDA)</w:t>
+      </w:r>
+    </w:p>
+    <w:p>
+      <w:pPr>
+        <w:keepNext w:val="0"/>
+        <w:keepLines w:val="0"/>
+        <w:widowControl/>
+        <w:numPr>
+          <w:numId w:val="0"/>
+        </w:numPr>
+        <w:suppressLineNumbers w:val="0"/>
+        <w:spacing w:before="0" w:beforeAutospacing="1" w:after="0" w:afterAutospacing="1"/>
+        <w:rPr>
+          <w:rFonts w:hint="default" w:ascii="Times New Roman" w:hAnsi="Times New Roman" w:cs="Times New Roman"/>
+          <w:sz w:val="24"/>
+          <w:szCs w:val="24"/>
+        </w:rPr>
+      </w:pPr>
+      <w:r>
+        <w:rPr>
+          <w:rFonts w:hint="default" w:ascii="Times New Roman" w:hAnsi="Times New Roman" w:cs="Times New Roman"/>
+          <w:sz w:val="24"/>
+          <w:szCs w:val="24"/>
+        </w:rPr>
+        <w:t>HR Analytics</w:t>
+      </w:r>
+    </w:p>
+    <w:p>
+      <w:pPr>
+        <w:keepNext w:val="0"/>
+        <w:keepLines w:val="0"/>
+        <w:widowControl/>
+        <w:numPr>
+          <w:numId w:val="0"/>
+        </w:numPr>
+        <w:suppressLineNumbers w:val="0"/>
+        <w:spacing w:before="0" w:beforeAutospacing="1" w:after="0" w:afterAutospacing="1"/>
+        <w:rPr>
+          <w:rFonts w:hint="default" w:ascii="Times New Roman" w:hAnsi="Times New Roman" w:cs="Times New Roman"/>
+          <w:sz w:val="24"/>
+          <w:szCs w:val="24"/>
+        </w:rPr>
+      </w:pPr>
+      <w:r>
+        <w:rPr>
+          <w:rFonts w:hint="default" w:ascii="Times New Roman" w:hAnsi="Times New Roman" w:cs="Times New Roman"/>
+          <w:sz w:val="24"/>
+          <w:szCs w:val="24"/>
+        </w:rPr>
+        <w:t>Dashboard Design</w:t>
+      </w:r>
+    </w:p>
+    <w:p>
+      <w:pPr>
+        <w:keepNext w:val="0"/>
+        <w:keepLines w:val="0"/>
+        <w:widowControl/>
+        <w:numPr>
+          <w:numId w:val="0"/>
+        </w:numPr>
+        <w:suppressLineNumbers w:val="0"/>
+        <w:spacing w:before="0" w:beforeAutospacing="1" w:after="0" w:afterAutospacing="1"/>
+        <w:rPr>
+          <w:rFonts w:hint="default" w:ascii="Times New Roman" w:hAnsi="Times New Roman" w:cs="Times New Roman"/>
+          <w:sz w:val="24"/>
+          <w:szCs w:val="24"/>
+        </w:rPr>
+      </w:pPr>
+      <w:r>
+        <w:rPr>
+          <w:rFonts w:hint="default" w:ascii="Times New Roman" w:hAnsi="Times New Roman" w:cs="Times New Roman"/>
+          <w:sz w:val="24"/>
+          <w:szCs w:val="24"/>
+        </w:rPr>
+        <w:t>Data Visualization</w:t>
+      </w:r>
+    </w:p>
+    <w:p>
+      <w:pPr>
+        <w:keepNext w:val="0"/>
+        <w:keepLines w:val="0"/>
+        <w:widowControl/>
+        <w:numPr>
+          <w:numId w:val="0"/>
+        </w:numPr>
+        <w:suppressLineNumbers w:val="0"/>
+        <w:spacing w:before="0" w:beforeAutospacing="1" w:after="0" w:afterAutospacing="1"/>
+        <w:rPr>
+          <w:rFonts w:hint="default" w:ascii="Times New Roman" w:hAnsi="Times New Roman" w:cs="Times New Roman"/>
+          <w:sz w:val="24"/>
+          <w:szCs w:val="24"/>
+        </w:rPr>
+      </w:pPr>
+      <w:r>
+        <w:rPr>
+          <w:rFonts w:hint="default" w:ascii="Times New Roman" w:hAnsi="Times New Roman" w:cs="Times New Roman"/>
+          <w:sz w:val="24"/>
+          <w:szCs w:val="24"/>
+        </w:rPr>
+        <w:t>KPI Development</w:t>
+      </w:r>
+    </w:p>
+    <w:p>
+      <w:pPr>
+        <w:keepNext w:val="0"/>
+        <w:keepLines w:val="0"/>
+        <w:widowControl/>
+        <w:numPr>
+          <w:numId w:val="0"/>
+        </w:numPr>
+        <w:suppressLineNumbers w:val="0"/>
+        <w:spacing w:before="0" w:beforeAutospacing="1" w:after="0" w:afterAutospacing="1"/>
+        <w:rPr>
+          <w:rFonts w:hint="default" w:ascii="Times New Roman" w:hAnsi="Times New Roman" w:cs="Times New Roman"/>
+          <w:sz w:val="24"/>
+          <w:szCs w:val="24"/>
+        </w:rPr>
+      </w:pPr>
+      <w:r>
+        <w:rPr>
+          <w:rFonts w:hint="default" w:ascii="Times New Roman" w:hAnsi="Times New Roman" w:cs="Times New Roman"/>
+          <w:sz w:val="24"/>
+          <w:szCs w:val="24"/>
+        </w:rPr>
+        <w:t>Business Intelligence</w:t>
+      </w:r>
+    </w:p>
+    <w:p>
+      <w:pPr>
+        <w:keepNext w:val="0"/>
+        <w:keepLines w:val="0"/>
+        <w:widowControl/>
+        <w:numPr>
+          <w:numId w:val="0"/>
+        </w:numPr>
+        <w:suppressLineNumbers w:val="0"/>
+        <w:spacing w:before="0" w:beforeAutospacing="1" w:after="0" w:afterAutospacing="1"/>
+        <w:rPr>
+          <w:rFonts w:hint="default" w:ascii="Times New Roman" w:hAnsi="Times New Roman" w:cs="Times New Roman"/>
+          <w:sz w:val="24"/>
+          <w:szCs w:val="24"/>
+        </w:rPr>
+      </w:pPr>
+      <w:r>
+        <w:rPr>
+          <w:rFonts w:hint="default" w:ascii="Times New Roman" w:hAnsi="Times New Roman" w:cs="Times New Roman"/>
+          <w:sz w:val="24"/>
+          <w:szCs w:val="24"/>
+        </w:rPr>
+        <w:t>Data Storytelling</w:t>
+      </w:r>
+    </w:p>
+    <w:p>
+      <w:pPr>
+        <w:pStyle w:val="2"/>
+        <w:keepNext w:val="0"/>
+        <w:keepLines w:val="0"/>
+        <w:widowControl/>
+        <w:suppressLineNumbers w:val="0"/>
+        <w:rPr>
+          <w:rFonts w:hint="default" w:ascii="Times New Roman" w:hAnsi="Times New Roman" w:cs="Times New Roman"/>
+          <w:sz w:val="24"/>
+          <w:szCs w:val="24"/>
+        </w:rPr>
+      </w:pPr>
+      <w:r>
+        <w:rPr>
+          <w:rFonts w:hint="default" w:ascii="Times New Roman" w:hAnsi="Times New Roman" w:cs="Times New Roman"/>
+          <w:b w:val="0"/>
+          <w:bCs w:val="0"/>
+          <w:sz w:val="24"/>
+          <w:szCs w:val="24"/>
+        </w:rPr>
+        <w:t>Conclusion</w:t>
       </w:r>
       <w:bookmarkStart w:id="0" w:name="_GoBack"/>
       <w:bookmarkEnd w:id="0"/>
     </w:p>
     <w:p>
       <w:pPr>
-        <w:pStyle w:val="2"/>
-        <w:keepNext w:val="0"/>
-        <w:keepLines w:val="0"/>
-        <w:widowControl/>
-        <w:suppressLineNumbers w:val="0"/>
-        <w:jc w:val="both"/>
-        <w:rPr>
-          <w:rFonts w:hint="default" w:ascii="Times New Roman" w:hAnsi="Times New Roman" w:cs="Times New Roman"/>
-          <w:sz w:val="24"/>
-          <w:szCs w:val="24"/>
-        </w:rPr>
-      </w:pPr>
-      <w:r>
-        <w:rPr>
-          <w:rFonts w:hint="default" w:ascii="Times New Roman" w:hAnsi="Times New Roman" w:cs="Times New Roman"/>
-          <w:sz w:val="24"/>
-          <w:szCs w:val="24"/>
-        </w:rPr>
-        <w:t>Business Recommendations</w:t>
-      </w:r>
-    </w:p>
-    <w:p>
-      <w:pPr>
-        <w:pStyle w:val="6"/>
+        <w:pStyle w:val="7"/>
         <w:keepNext w:val="0"/>
         <w:keepLines w:val="0"/>
         <w:widowControl/>
         <w:suppressLineNumbers w:val="0"/>
         <w:spacing w:before="0" w:beforeAutospacing="1" w:after="0" w:afterAutospacing="1"/>
         <w:ind w:left="0" w:right="0"/>
-        <w:jc w:val="both"/>
-        <w:rPr>
-          <w:rFonts w:hint="default" w:ascii="Times New Roman" w:hAnsi="Times New Roman" w:cs="Times New Roman"/>
-          <w:sz w:val="24"/>
-          <w:szCs w:val="24"/>
-        </w:rPr>
-      </w:pPr>
-      <w:r>
-        <w:rPr>
-          <w:rFonts w:hint="default" w:ascii="Times New Roman" w:hAnsi="Times New Roman" w:cs="Times New Roman"/>
-          <w:sz w:val="24"/>
-          <w:szCs w:val="24"/>
-        </w:rPr>
-        <w:t>Based on the findings, several recommendations can enhance workforce management and organizational performance.</w:t>
-      </w:r>
-    </w:p>
-    <w:p>
-      <w:pPr>
-        <w:keepNext w:val="0"/>
-        <w:keepLines w:val="0"/>
-        <w:widowControl/>
-        <w:numPr>
-          <w:ilvl w:val="0"/>
-          <w:numId w:val="1"/>
-        </w:numPr>
-        <w:suppressLineNumbers w:val="0"/>
-        <w:spacing w:before="0" w:beforeAutospacing="1" w:after="0" w:afterAutospacing="1"/>
-        <w:ind w:left="720" w:hanging="360"/>
-        <w:jc w:val="both"/>
-        <w:rPr>
-          <w:rFonts w:hint="default" w:ascii="Times New Roman" w:hAnsi="Times New Roman" w:cs="Times New Roman"/>
-          <w:sz w:val="24"/>
-          <w:szCs w:val="24"/>
-        </w:rPr>
-      </w:pPr>
-      <w:r>
-        <w:rPr>
-          <w:rFonts w:hint="default" w:ascii="Times New Roman" w:hAnsi="Times New Roman" w:cs="Times New Roman"/>
-          <w:sz w:val="24"/>
-          <w:szCs w:val="24"/>
-        </w:rPr>
-        <w:t>Strengthen employee retention initiatives by identifying and addressing factors contributing to employee turnover.</w:t>
-      </w:r>
-    </w:p>
-    <w:p>
-      <w:pPr>
-        <w:keepNext w:val="0"/>
-        <w:keepLines w:val="0"/>
-        <w:widowControl/>
-        <w:numPr>
-          <w:ilvl w:val="0"/>
-          <w:numId w:val="1"/>
-        </w:numPr>
-        <w:suppressLineNumbers w:val="0"/>
-        <w:spacing w:before="0" w:beforeAutospacing="1" w:after="0" w:afterAutospacing="1"/>
-        <w:ind w:left="720" w:hanging="360"/>
-        <w:jc w:val="both"/>
-        <w:rPr>
-          <w:rFonts w:hint="default" w:ascii="Times New Roman" w:hAnsi="Times New Roman" w:cs="Times New Roman"/>
-          <w:sz w:val="24"/>
-          <w:szCs w:val="24"/>
-        </w:rPr>
-      </w:pPr>
-      <w:r>
-        <w:rPr>
-          <w:rFonts w:hint="default" w:ascii="Times New Roman" w:hAnsi="Times New Roman" w:cs="Times New Roman"/>
-          <w:sz w:val="24"/>
-          <w:szCs w:val="24"/>
-        </w:rPr>
-        <w:t>Conduct targeted exit interviews and engagement surveys to better understand why high-performing employees leave the organization.</w:t>
-      </w:r>
-    </w:p>
-    <w:p>
-      <w:pPr>
-        <w:keepNext w:val="0"/>
-        <w:keepLines w:val="0"/>
-        <w:widowControl/>
-        <w:numPr>
-          <w:ilvl w:val="0"/>
-          <w:numId w:val="1"/>
-        </w:numPr>
-        <w:suppressLineNumbers w:val="0"/>
-        <w:spacing w:before="0" w:beforeAutospacing="1" w:after="0" w:afterAutospacing="1"/>
-        <w:ind w:left="720" w:hanging="360"/>
-        <w:jc w:val="both"/>
-        <w:rPr>
-          <w:rFonts w:hint="default" w:ascii="Times New Roman" w:hAnsi="Times New Roman" w:cs="Times New Roman"/>
-          <w:sz w:val="24"/>
-          <w:szCs w:val="24"/>
-        </w:rPr>
-      </w:pPr>
-      <w:r>
-        <w:rPr>
-          <w:rFonts w:hint="default" w:ascii="Times New Roman" w:hAnsi="Times New Roman" w:cs="Times New Roman"/>
-          <w:sz w:val="24"/>
-          <w:szCs w:val="24"/>
-        </w:rPr>
-        <w:t>Review departmental compensation structures periodically to ensure fairness, competitiveness, and alignment with organizational objectives.</w:t>
-      </w:r>
-    </w:p>
-    <w:p>
-      <w:pPr>
-        <w:keepNext w:val="0"/>
-        <w:keepLines w:val="0"/>
-        <w:widowControl/>
-        <w:numPr>
-          <w:ilvl w:val="0"/>
-          <w:numId w:val="1"/>
-        </w:numPr>
-        <w:suppressLineNumbers w:val="0"/>
-        <w:spacing w:before="0" w:beforeAutospacing="1" w:after="0" w:afterAutospacing="1"/>
-        <w:ind w:left="720" w:hanging="360"/>
-        <w:jc w:val="both"/>
-        <w:rPr>
-          <w:rFonts w:hint="default" w:ascii="Times New Roman" w:hAnsi="Times New Roman" w:cs="Times New Roman"/>
-          <w:sz w:val="24"/>
-          <w:szCs w:val="24"/>
-        </w:rPr>
-      </w:pPr>
-      <w:r>
-        <w:rPr>
-          <w:rFonts w:hint="default" w:ascii="Times New Roman" w:hAnsi="Times New Roman" w:cs="Times New Roman"/>
-          <w:sz w:val="24"/>
-          <w:szCs w:val="24"/>
-        </w:rPr>
-        <w:t>Continue leveraging performance-based reward systems while regularly evaluating their effectiveness in motivating employees and retaining top talent.</w:t>
-      </w:r>
-    </w:p>
-    <w:p>
-      <w:pPr>
-        <w:keepNext w:val="0"/>
-        <w:keepLines w:val="0"/>
-        <w:widowControl/>
-        <w:numPr>
-          <w:ilvl w:val="0"/>
-          <w:numId w:val="1"/>
-        </w:numPr>
-        <w:suppressLineNumbers w:val="0"/>
-        <w:spacing w:before="0" w:beforeAutospacing="1" w:after="0" w:afterAutospacing="1"/>
-        <w:ind w:left="720" w:hanging="360"/>
-        <w:jc w:val="both"/>
-        <w:rPr>
-          <w:rFonts w:hint="default" w:ascii="Times New Roman" w:hAnsi="Times New Roman" w:cs="Times New Roman"/>
-          <w:sz w:val="24"/>
-          <w:szCs w:val="24"/>
-        </w:rPr>
-      </w:pPr>
-      <w:r>
-        <w:rPr>
-          <w:rFonts w:hint="default" w:ascii="Times New Roman" w:hAnsi="Times New Roman" w:cs="Times New Roman"/>
-          <w:sz w:val="24"/>
-          <w:szCs w:val="24"/>
-        </w:rPr>
-        <w:t>Integrate the dashboard into routine HR reporting to support ongoing workforce monitoring, strategic planning, and evidence-based decision-making.</w:t>
-      </w:r>
-    </w:p>
-    <w:p>
-      <w:pPr>
-        <w:pStyle w:val="6"/>
+        <w:rPr>
+          <w:rFonts w:hint="default" w:ascii="Times New Roman" w:hAnsi="Times New Roman" w:cs="Times New Roman"/>
+          <w:sz w:val="24"/>
+          <w:szCs w:val="24"/>
+        </w:rPr>
+      </w:pPr>
+      <w:r>
+        <w:rPr>
+          <w:rFonts w:hint="default" w:ascii="Times New Roman" w:hAnsi="Times New Roman" w:cs="Times New Roman"/>
+          <w:sz w:val="24"/>
+          <w:szCs w:val="24"/>
+        </w:rPr>
+        <w:t>This project demonstrates the complete analytics lifecycle—from transforming a raw and inconsistent dataset into a reliable source of business intelligence to communicating actionable insights through an interactive dashboard.</w:t>
+      </w:r>
+    </w:p>
+    <w:p>
+      <w:pPr>
+        <w:pStyle w:val="7"/>
+        <w:keepNext w:val="0"/>
+        <w:keepLines w:val="0"/>
+        <w:widowControl/>
+        <w:suppressLineNumbers w:val="0"/>
+        <w:rPr>
+          <w:rFonts w:hint="default" w:ascii="Times New Roman" w:hAnsi="Times New Roman" w:cs="Times New Roman"/>
+          <w:sz w:val="24"/>
+          <w:szCs w:val="24"/>
+        </w:rPr>
+      </w:pPr>
+      <w:r>
+        <w:rPr>
+          <w:rFonts w:hint="default" w:ascii="Times New Roman" w:hAnsi="Times New Roman" w:cs="Times New Roman"/>
+          <w:sz w:val="24"/>
+          <w:szCs w:val="24"/>
+        </w:rPr>
+        <w:t>Beyond developing technical proficiency in Microsoft Excel, the project highlights the importance of combining data preparation, analytical thinking, and visualization to solve real business problems. The resulting dashboard provides HR decision-makers with a practical tool for monitoring workforce performance, evaluating employee retention, planning compensation strategies, and supporting long-term organizational growth.</w:t>
+      </w:r>
+    </w:p>
+    <w:p>
+      <w:pPr>
+        <w:pStyle w:val="7"/>
         <w:keepNext w:val="0"/>
         <w:keepLines w:val="0"/>
         <w:widowControl/>
@@ -1429,163 +1966,6 @@
     </w:sectPr>
   </w:body>
 </w:document>
-</file>
-
-<file path=word/numbering.xml><?xml version="1.0" encoding="utf-8"?>
-<w:numbering xmlns:wpc="http://schemas.microsoft.com/office/word/2010/wordprocessingCanvas" xmlns:mc="http://schemas.openxmlformats.org/markup-compatibility/2006" xmlns:o="urn:schemas-microsoft-com:office:office" xmlns:r="http://schemas.openxmlformats.org/officeDocument/2006/relationships" xmlns:m="http://schemas.openxmlformats.org/officeDocument/2006/math" xmlns:v="urn:schemas-microsoft-com:vml" xmlns:wp14="http://schemas.microsoft.com/office/word/2010/wordprocessingDrawing" xmlns:wp="http://schemas.openxmlformats.org/drawingml/2006/wordprocessingDrawing" xmlns:w10="urn:schemas-microsoft-com:office:word" xmlns:w="http://schemas.openxmlformats.org/wordprocessingml/2006/main" xmlns:w14="http://schemas.microsoft.com/office/word/2010/wordml" xmlns:wpg="http://schemas.microsoft.com/office/word/2010/wordprocessingGroup" xmlns:wpi="http://schemas.microsoft.com/office/word/2010/wordprocessingInk" xmlns:wne="http://schemas.microsoft.com/office/word/2006/wordml" xmlns:wps="http://schemas.microsoft.com/office/word/2010/wordprocessingShape" xmlns:wpsCustomData="http://www.wps.cn/officeDocument/2013/wpsCustomData" mc:Ignorable="w14 wp14">
-  <w:abstractNum w:abstractNumId="0">
-    <w:nsid w:val="0429900A"/>
-    <w:multiLevelType w:val="multilevel"/>
-    <w:tmpl w:val="0429900A"/>
-    <w:lvl w:ilvl="0" w:tentative="0">
-      <w:start w:val="1"/>
-      <w:numFmt w:val="bullet"/>
-      <w:lvlText w:val=""/>
-      <w:lvlJc w:val="left"/>
-      <w:pPr>
-        <w:tabs>
-          <w:tab w:val="left" w:pos="720"/>
-        </w:tabs>
-        <w:ind w:left="720" w:hanging="360"/>
-      </w:pPr>
-      <w:rPr>
-        <w:rFonts w:hint="default" w:ascii="Symbol" w:hAnsi="Symbol" w:cs="Symbol"/>
-        <w:sz w:val="20"/>
-      </w:rPr>
-    </w:lvl>
-    <w:lvl w:ilvl="1" w:tentative="0">
-      <w:start w:val="1"/>
-      <w:numFmt w:val="bullet"/>
-      <w:lvlText w:val="o"/>
-      <w:lvlJc w:val="left"/>
-      <w:pPr>
-        <w:tabs>
-          <w:tab w:val="left" w:pos="1440"/>
-        </w:tabs>
-        <w:ind w:left="1440" w:hanging="360"/>
-      </w:pPr>
-      <w:rPr>
-        <w:rFonts w:hint="default" w:ascii="Courier New" w:hAnsi="Courier New" w:cs="Courier New"/>
-        <w:sz w:val="20"/>
-      </w:rPr>
-    </w:lvl>
-    <w:lvl w:ilvl="2" w:tentative="0">
-      <w:start w:val="1"/>
-      <w:numFmt w:val="bullet"/>
-      <w:lvlText w:val=""/>
-      <w:lvlJc w:val="left"/>
-      <w:pPr>
-        <w:tabs>
-          <w:tab w:val="left" w:pos="2160"/>
-        </w:tabs>
-        <w:ind w:left="2160" w:hanging="360"/>
-      </w:pPr>
-      <w:rPr>
-        <w:rFonts w:hint="default" w:ascii="Wingdings" w:hAnsi="Wingdings" w:cs="Wingdings"/>
-        <w:sz w:val="20"/>
-      </w:rPr>
-    </w:lvl>
-    <w:lvl w:ilvl="3" w:tentative="0">
-      <w:start w:val="1"/>
-      <w:numFmt w:val="bullet"/>
-      <w:lvlText w:val=""/>
-      <w:lvlJc w:val="left"/>
-      <w:pPr>
-        <w:tabs>
-          <w:tab w:val="left" w:pos="2880"/>
-        </w:tabs>
-        <w:ind w:left="2880" w:hanging="360"/>
-      </w:pPr>
-      <w:rPr>
-        <w:rFonts w:hint="default" w:ascii="Wingdings" w:hAnsi="Wingdings" w:cs="Wingdings"/>
-        <w:sz w:val="20"/>
-      </w:rPr>
-    </w:lvl>
-    <w:lvl w:ilvl="4" w:tentative="0">
-      <w:start w:val="1"/>
-      <w:numFmt w:val="bullet"/>
-      <w:lvlText w:val=""/>
-      <w:lvlJc w:val="left"/>
-      <w:pPr>
-        <w:tabs>
-          <w:tab w:val="left" w:pos="3600"/>
-        </w:tabs>
-        <w:ind w:left="3600" w:hanging="360"/>
-      </w:pPr>
-      <w:rPr>
-        <w:rFonts w:hint="default" w:ascii="Wingdings" w:hAnsi="Wingdings" w:cs="Wingdings"/>
-        <w:sz w:val="20"/>
-      </w:rPr>
-    </w:lvl>
-    <w:lvl w:ilvl="5" w:tentative="0">
-      <w:start w:val="1"/>
-      <w:numFmt w:val="bullet"/>
-      <w:lvlText w:val=""/>
-      <w:lvlJc w:val="left"/>
-      <w:pPr>
-        <w:tabs>
-          <w:tab w:val="left" w:pos="4320"/>
-        </w:tabs>
-        <w:ind w:left="4320" w:hanging="360"/>
-      </w:pPr>
-      <w:rPr>
-        <w:rFonts w:hint="default" w:ascii="Wingdings" w:hAnsi="Wingdings" w:cs="Wingdings"/>
-        <w:sz w:val="20"/>
-      </w:rPr>
-    </w:lvl>
-    <w:lvl w:ilvl="6" w:tentative="0">
-      <w:start w:val="1"/>
-      <w:numFmt w:val="bullet"/>
-      <w:lvlText w:val=""/>
-      <w:lvlJc w:val="left"/>
-      <w:pPr>
-        <w:tabs>
-          <w:tab w:val="left" w:pos="5040"/>
-        </w:tabs>
-        <w:ind w:left="5040" w:hanging="360"/>
-      </w:pPr>
-      <w:rPr>
-        <w:rFonts w:hint="default" w:ascii="Wingdings" w:hAnsi="Wingdings" w:cs="Wingdings"/>
-        <w:sz w:val="20"/>
-      </w:rPr>
-    </w:lvl>
-    <w:lvl w:ilvl="7" w:tentative="0">
-      <w:start w:val="1"/>
-      <w:numFmt w:val="bullet"/>
-      <w:lvlText w:val=""/>
-      <w:lvlJc w:val="left"/>
-      <w:pPr>
-        <w:tabs>
-          <w:tab w:val="left" w:pos="5760"/>
-        </w:tabs>
-        <w:ind w:left="5760" w:hanging="360"/>
-      </w:pPr>
-      <w:rPr>
-        <w:rFonts w:hint="default" w:ascii="Wingdings" w:hAnsi="Wingdings" w:cs="Wingdings"/>
-        <w:sz w:val="20"/>
-      </w:rPr>
-    </w:lvl>
-    <w:lvl w:ilvl="8" w:tentative="0">
-      <w:start w:val="1"/>
-      <w:numFmt w:val="bullet"/>
-      <w:lvlText w:val=""/>
-      <w:lvlJc w:val="left"/>
-      <w:pPr>
-        <w:tabs>
-          <w:tab w:val="left" w:pos="6480"/>
-        </w:tabs>
-        <w:ind w:left="6480" w:hanging="360"/>
-      </w:pPr>
-      <w:rPr>
-        <w:rFonts w:hint="default" w:ascii="Wingdings" w:hAnsi="Wingdings" w:cs="Wingdings"/>
-        <w:sz w:val="20"/>
-      </w:rPr>
-    </w:lvl>
-  </w:abstractNum>
-  <w:num w:numId="1">
-    <w:abstractNumId w:val="0"/>
-  </w:num>
-</w:numbering>
 </file>
 
 <file path=word/styles.xml><?xml version="1.0" encoding="utf-8"?>
@@ -1897,13 +2277,34 @@
       <w:lang w:val="en-US" w:eastAsia="zh-CN" w:bidi="ar"/>
     </w:rPr>
   </w:style>
-  <w:style w:type="character" w:default="1" w:styleId="4">
+  <w:style w:type="paragraph" w:styleId="4">
+    <w:name w:val="heading 3"/>
+    <w:next w:val="1"/>
+    <w:semiHidden/>
+    <w:unhideWhenUsed/>
+    <w:qFormat/>
+    <w:uiPriority w:val="0"/>
+    <w:pPr>
+      <w:spacing w:before="0" w:beforeAutospacing="1" w:after="0" w:afterAutospacing="1"/>
+      <w:jc w:val="left"/>
+    </w:pPr>
+    <w:rPr>
+      <w:rFonts w:hint="eastAsia" w:ascii="SimSun" w:hAnsi="SimSun" w:eastAsia="SimSun" w:cs="SimSun"/>
+      <w:b/>
+      <w:bCs/>
+      <w:kern w:val="0"/>
+      <w:sz w:val="27"/>
+      <w:szCs w:val="27"/>
+      <w:lang w:val="en-US" w:eastAsia="zh-CN" w:bidi="ar"/>
+    </w:rPr>
+  </w:style>
+  <w:style w:type="character" w:default="1" w:styleId="5">
     <w:name w:val="Default Paragraph Font"/>
     <w:semiHidden/>
     <w:qFormat/>
     <w:uiPriority w:val="0"/>
   </w:style>
-  <w:style w:type="table" w:default="1" w:styleId="5">
+  <w:style w:type="table" w:default="1" w:styleId="6">
     <w:name w:val="Normal Table"/>
     <w:semiHidden/>
     <w:qFormat/>
@@ -1917,7 +2318,7 @@
       </w:tblCellMar>
     </w:tblPr>
   </w:style>
-  <w:style w:type="paragraph" w:styleId="6">
+  <w:style w:type="paragraph" w:styleId="7">
     <w:name w:val="Normal (Web)"/>
     <w:uiPriority w:val="0"/>
     <w:pPr>
@@ -1933,9 +2334,9 @@
       <w:lang w:val="en-US" w:eastAsia="zh-CN" w:bidi="ar"/>
     </w:rPr>
   </w:style>
-  <w:style w:type="character" w:styleId="7">
+  <w:style w:type="character" w:styleId="8">
     <w:name w:val="Strong"/>
-    <w:basedOn w:val="4"/>
+    <w:basedOn w:val="5"/>
     <w:qFormat/>
     <w:uiPriority w:val="0"/>
     <w:rPr>

</xml_diff>